<commit_message>
update homepage and CV
</commit_message>
<xml_diff>
--- a/assets/CV_Zhihan_Zhang.docx
+++ b/assets/CV_Zhihan_Zhang.docx
@@ -1518,7 +1518,23 @@
           <w:sz w:val="22"/>
           <w:szCs w:val="20"/>
         </w:rPr>
-        <w:t xml:space="preserve"> [3]</w:t>
+        <w:t xml:space="preserve"> [</w:t>
+      </w:r>
+      <w:r>
+        <w:rPr>
+          <w:rFonts w:ascii="Times New Roman" w:hAnsi="Times New Roman"/>
+          <w:sz w:val="22"/>
+          <w:szCs w:val="20"/>
+        </w:rPr>
+        <w:t>2</w:t>
+      </w:r>
+      <w:r>
+        <w:rPr>
+          <w:rFonts w:ascii="Times New Roman" w:hAnsi="Times New Roman"/>
+          <w:sz w:val="22"/>
+          <w:szCs w:val="20"/>
+        </w:rPr>
+        <w:t>]</w:t>
       </w:r>
       <w:r>
         <w:rPr>
@@ -1554,7 +1570,21 @@
           <w:rFonts w:ascii="Times New Roman" w:hAnsi="Times New Roman"/>
           <w:sz w:val="22"/>
         </w:rPr>
-        <w:t xml:space="preserve"> [4]</w:t>
+        <w:t xml:space="preserve"> [</w:t>
+      </w:r>
+      <w:r>
+        <w:rPr>
+          <w:rFonts w:ascii="Times New Roman" w:hAnsi="Times New Roman"/>
+          <w:sz w:val="22"/>
+        </w:rPr>
+        <w:t>3</w:t>
+      </w:r>
+      <w:r>
+        <w:rPr>
+          <w:rFonts w:ascii="Times New Roman" w:hAnsi="Times New Roman"/>
+          <w:sz w:val="22"/>
+        </w:rPr>
+        <w:t>]</w:t>
       </w:r>
     </w:p>
     <w:p>
@@ -1821,7 +1851,21 @@
           <w:rFonts w:ascii="Times New Roman" w:hAnsi="Times New Roman"/>
           <w:sz w:val="22"/>
         </w:rPr>
-        <w:t xml:space="preserve"> [1], Diversified Co-Attention towards Informative Live Video Commenting [2]</w:t>
+        <w:t xml:space="preserve"> [1], Diversified Co-Attention towards Informative Live Video Commenting [</w:t>
+      </w:r>
+      <w:r>
+        <w:rPr>
+          <w:rFonts w:ascii="Times New Roman" w:hAnsi="Times New Roman"/>
+          <w:sz w:val="22"/>
+        </w:rPr>
+        <w:t>4</w:t>
+      </w:r>
+      <w:r>
+        <w:rPr>
+          <w:rFonts w:ascii="Times New Roman" w:hAnsi="Times New Roman"/>
+          <w:sz w:val="22"/>
+        </w:rPr>
+        <w:t>]</w:t>
       </w:r>
     </w:p>
     <w:p>
@@ -1914,13 +1958,15 @@
         <w:adjustRightInd w:val="0"/>
         <w:snapToGrid w:val="0"/>
         <w:rPr>
-          <w:rFonts w:ascii="Times New Roman" w:hAnsi="Times New Roman"/>
-          <w:sz w:val="22"/>
-        </w:rPr>
-      </w:pPr>
-      <w:r>
-        <w:rPr>
           <w:rFonts w:ascii="Times New Roman" w:hAnsi="Times New Roman" w:hint="eastAsia"/>
+          <w:b/>
+          <w:sz w:val="22"/>
+          <w:u w:val="single"/>
+        </w:rPr>
+      </w:pPr>
+      <w:r>
+        <w:rPr>
+          <w:rFonts w:ascii="Times New Roman" w:hAnsi="Times New Roman"/>
           <w:sz w:val="22"/>
         </w:rPr>
         <w:t>[</w:t>
@@ -1930,7 +1976,37 @@
           <w:rFonts w:ascii="Times New Roman" w:hAnsi="Times New Roman"/>
           <w:sz w:val="22"/>
         </w:rPr>
-        <w:t xml:space="preserve">4] </w:t>
+        <w:t>4</w:t>
+      </w:r>
+      <w:r>
+        <w:rPr>
+          <w:rFonts w:ascii="Times New Roman" w:hAnsi="Times New Roman"/>
+          <w:sz w:val="22"/>
+        </w:rPr>
+        <w:t>]</w:t>
+      </w:r>
+      <w:r>
+        <w:rPr>
+          <w:rFonts w:ascii="Times New Roman" w:hAnsi="Times New Roman"/>
+          <w:b/>
+          <w:sz w:val="22"/>
+        </w:rPr>
+        <w:t xml:space="preserve"> </w:t>
+      </w:r>
+      <w:r>
+        <w:rPr>
+          <w:rFonts w:ascii="Times New Roman" w:hAnsi="Times New Roman"/>
+          <w:b/>
+          <w:sz w:val="22"/>
+        </w:rPr>
+        <w:t>Zhihan Zhang</w:t>
+      </w:r>
+      <w:r>
+        <w:rPr>
+          <w:rFonts w:ascii="Times New Roman" w:hAnsi="Times New Roman"/>
+          <w:sz w:val="22"/>
+        </w:rPr>
+        <w:t xml:space="preserve">, </w:t>
       </w:r>
       <w:proofErr w:type="spellStart"/>
       <w:r>
@@ -1938,7 +2014,7 @@
           <w:rFonts w:ascii="Times New Roman" w:hAnsi="Times New Roman"/>
           <w:sz w:val="22"/>
         </w:rPr>
-        <w:t>Daheng</w:t>
+        <w:t>Zhiyi</w:t>
       </w:r>
       <w:proofErr w:type="spellEnd"/>
       <w:r>
@@ -1946,22 +2022,7 @@
           <w:rFonts w:ascii="Times New Roman" w:hAnsi="Times New Roman"/>
           <w:sz w:val="22"/>
         </w:rPr>
-        <w:t xml:space="preserve"> Wang, </w:t>
-      </w:r>
-      <w:r>
-        <w:rPr>
-          <w:rFonts w:ascii="Times New Roman" w:hAnsi="Times New Roman"/>
-          <w:b/>
-          <w:sz w:val="22"/>
-        </w:rPr>
-        <w:t>Zhihan Zhang</w:t>
-      </w:r>
-      <w:r>
-        <w:rPr>
-          <w:rFonts w:ascii="Times New Roman" w:hAnsi="Times New Roman"/>
-          <w:sz w:val="22"/>
-        </w:rPr>
-        <w:t xml:space="preserve">, </w:t>
+        <w:t xml:space="preserve"> Yin, </w:t>
       </w:r>
       <w:proofErr w:type="spellStart"/>
       <w:r>
@@ -1969,7 +2030,7 @@
           <w:rFonts w:ascii="Times New Roman" w:hAnsi="Times New Roman"/>
           <w:sz w:val="22"/>
         </w:rPr>
-        <w:t>Yihong</w:t>
+        <w:t>Shuhuai</w:t>
       </w:r>
       <w:proofErr w:type="spellEnd"/>
       <w:r>
@@ -1977,7 +2038,7 @@
           <w:rFonts w:ascii="Times New Roman" w:hAnsi="Times New Roman"/>
           <w:sz w:val="22"/>
         </w:rPr>
-        <w:t xml:space="preserve"> Ma, Tong Zhao, </w:t>
+        <w:t xml:space="preserve"> Ren, </w:t>
       </w:r>
       <w:proofErr w:type="spellStart"/>
       <w:r>
@@ -1985,7 +2046,7 @@
           <w:rFonts w:ascii="Times New Roman" w:hAnsi="Times New Roman"/>
           <w:sz w:val="22"/>
         </w:rPr>
-        <w:t>Tianwen</w:t>
+        <w:t>Xinhang</w:t>
       </w:r>
       <w:proofErr w:type="spellEnd"/>
       <w:r>
@@ -1993,54 +2054,93 @@
           <w:rFonts w:ascii="Times New Roman" w:hAnsi="Times New Roman"/>
           <w:sz w:val="22"/>
         </w:rPr>
-        <w:t xml:space="preserve"> Jiang, Nitesh Chawla and Meng Jiang</w:t>
-      </w:r>
-      <w:r>
-        <w:rPr>
-          <w:rFonts w:ascii="Times New Roman" w:hAnsi="Times New Roman"/>
-          <w:sz w:val="22"/>
-        </w:rPr>
-        <w:t xml:space="preserve">. </w:t>
-      </w:r>
-      <w:r>
-        <w:rPr>
-          <w:rFonts w:ascii="Times New Roman" w:hAnsi="Times New Roman"/>
-          <w:sz w:val="22"/>
-        </w:rPr>
-        <w:t>Learning Attribute-Structure Co-Evolutions in Dynamic Graphs</w:t>
-      </w:r>
-      <w:r>
-        <w:rPr>
-          <w:rFonts w:ascii="Times New Roman" w:hAnsi="Times New Roman"/>
-          <w:sz w:val="22"/>
-        </w:rPr>
-        <w:t xml:space="preserve">. In </w:t>
-      </w:r>
+        <w:t xml:space="preserve"> Li and </w:t>
+      </w:r>
+      <w:proofErr w:type="spellStart"/>
+      <w:r>
+        <w:rPr>
+          <w:rFonts w:ascii="Times New Roman" w:hAnsi="Times New Roman"/>
+          <w:sz w:val="22"/>
+        </w:rPr>
+        <w:t>Shicheng</w:t>
+      </w:r>
+      <w:proofErr w:type="spellEnd"/>
+      <w:r>
+        <w:rPr>
+          <w:rFonts w:ascii="Times New Roman" w:hAnsi="Times New Roman"/>
+          <w:sz w:val="22"/>
+        </w:rPr>
+        <w:t xml:space="preserve"> Li. DCA: Diversified Co-Attention </w:t>
+      </w:r>
+      <w:bookmarkStart w:id="6" w:name="_Hlk25177259"/>
+      <w:r>
+        <w:rPr>
+          <w:rFonts w:ascii="Times New Roman" w:hAnsi="Times New Roman" w:hint="eastAsia"/>
+          <w:sz w:val="22"/>
+        </w:rPr>
+        <w:t>t</w:t>
+      </w:r>
+      <w:r>
+        <w:rPr>
+          <w:rFonts w:ascii="Times New Roman" w:hAnsi="Times New Roman"/>
+          <w:sz w:val="22"/>
+        </w:rPr>
+        <w:t>owards Informative Live Video Commenting</w:t>
+      </w:r>
+      <w:bookmarkEnd w:id="6"/>
       <w:r>
         <w:rPr>
           <w:rFonts w:ascii="Times New Roman" w:hAnsi="Times New Roman"/>
           <w:i/>
           <w:sz w:val="22"/>
         </w:rPr>
-        <w:t>KDD Workshop on Deep Learning on Graphs: Methods and Applications (</w:t>
-      </w:r>
-      <w:r>
-        <w:rPr>
-          <w:rFonts w:ascii="Times New Roman" w:hAnsi="Times New Roman"/>
-          <w:b/>
+        <w:t>.</w:t>
+      </w:r>
+      <w:r>
+        <w:rPr>
+          <w:rFonts w:ascii="Times New Roman" w:hAnsi="Times New Roman"/>
+          <w:sz w:val="22"/>
+        </w:rPr>
+        <w:t xml:space="preserve"> </w:t>
+      </w:r>
+      <w:r>
+        <w:rPr>
+          <w:rFonts w:ascii="Times New Roman" w:hAnsi="Times New Roman"/>
+          <w:sz w:val="22"/>
+        </w:rPr>
+        <w:t xml:space="preserve">In </w:t>
+      </w:r>
+      <w:r>
+        <w:rPr>
+          <w:rFonts w:ascii="Times New Roman" w:hAnsi="Times New Roman"/>
           <w:i/>
           <w:sz w:val="22"/>
         </w:rPr>
-        <w:t>KDD-DLG</w:t>
-      </w:r>
-      <w:bookmarkStart w:id="6" w:name="_GoBack"/>
-      <w:bookmarkEnd w:id="6"/>
+        <w:t>CCF International Conference on Natural Language Processing and Chinese Computing</w:t>
+      </w:r>
       <w:r>
         <w:rPr>
           <w:rFonts w:ascii="Times New Roman" w:hAnsi="Times New Roman"/>
           <w:i/>
           <w:sz w:val="22"/>
         </w:rPr>
+        <w:t xml:space="preserve"> (</w:t>
+      </w:r>
+      <w:r>
+        <w:rPr>
+          <w:rFonts w:ascii="Times New Roman" w:hAnsi="Times New Roman"/>
+          <w:b/>
+          <w:i/>
+          <w:sz w:val="22"/>
+        </w:rPr>
+        <w:t>NLPCC</w:t>
+      </w:r>
+      <w:r>
+        <w:rPr>
+          <w:rFonts w:ascii="Times New Roman" w:hAnsi="Times New Roman"/>
+          <w:i/>
+          <w:sz w:val="22"/>
+        </w:rPr>
         <w:t>)</w:t>
       </w:r>
       <w:r>
@@ -2050,61 +2150,9 @@
         </w:rPr>
         <w:t>, 2020.</w:t>
       </w:r>
-    </w:p>
-    <w:p>
-      <w:pPr>
-        <w:tabs>
-          <w:tab w:val="right" w:pos="10490"/>
-        </w:tabs>
-        <w:adjustRightInd w:val="0"/>
-        <w:snapToGrid w:val="0"/>
-        <w:rPr>
-          <w:rFonts w:ascii="Times New Roman" w:hAnsi="Times New Roman"/>
-          <w:sz w:val="22"/>
-        </w:rPr>
-      </w:pPr>
-      <w:r>
-        <w:rPr>
-          <w:rFonts w:ascii="Times New Roman" w:hAnsi="Times New Roman"/>
-          <w:sz w:val="22"/>
-        </w:rPr>
-        <w:t xml:space="preserve">[3] </w:t>
-      </w:r>
-      <w:proofErr w:type="spellStart"/>
-      <w:r>
-        <w:rPr>
-          <w:rFonts w:ascii="Times New Roman" w:hAnsi="Times New Roman"/>
-          <w:sz w:val="22"/>
-        </w:rPr>
-        <w:t>Tianwen</w:t>
-      </w:r>
-      <w:proofErr w:type="spellEnd"/>
-      <w:r>
-        <w:rPr>
-          <w:rFonts w:ascii="Times New Roman" w:hAnsi="Times New Roman"/>
-          <w:sz w:val="22"/>
-        </w:rPr>
-        <w:t xml:space="preserve"> Jiang*, </w:t>
-      </w:r>
-      <w:r>
-        <w:rPr>
-          <w:rFonts w:ascii="Times New Roman" w:hAnsi="Times New Roman"/>
-          <w:b/>
-          <w:sz w:val="22"/>
-        </w:rPr>
-        <w:t>Zhihan Zhang</w:t>
-      </w:r>
-      <w:r>
-        <w:rPr>
-          <w:rFonts w:ascii="Times New Roman" w:hAnsi="Times New Roman"/>
-          <w:sz w:val="22"/>
-        </w:rPr>
-        <w:t>*, Tong Zhao, Bing Qin, Ting Liu, Nitesh Chawla and Meng Jiang. CTGA: Graph-based Biomedical Literature Search.</w:t>
-      </w:r>
-      <w:r>
-        <w:rPr>
-          <w:rFonts w:ascii="Times New Roman" w:hAnsi="Times New Roman"/>
-          <w:i/>
+      <w:r>
+        <w:rPr>
+          <w:rFonts w:ascii="Times New Roman" w:hAnsi="Times New Roman"/>
           <w:sz w:val="22"/>
         </w:rPr>
         <w:t xml:space="preserve"> </w:t>
@@ -2114,91 +2162,7 @@
           <w:rFonts w:ascii="Times New Roman" w:hAnsi="Times New Roman"/>
           <w:sz w:val="22"/>
         </w:rPr>
-        <w:t>In </w:t>
-      </w:r>
-      <w:r>
-        <w:rPr>
-          <w:rFonts w:ascii="Times New Roman" w:hAnsi="Times New Roman"/>
-          <w:i/>
-          <w:iCs/>
-          <w:sz w:val="22"/>
-        </w:rPr>
-        <w:t>IEEE International Conference on Bioinformatics and Biomedicine</w:t>
-      </w:r>
-      <w:r>
-        <w:rPr>
-          <w:rFonts w:ascii="Times New Roman" w:hAnsi="Times New Roman"/>
-          <w:b/>
-          <w:i/>
-          <w:iCs/>
-          <w:sz w:val="22"/>
-        </w:rPr>
-        <w:t xml:space="preserve"> </w:t>
-      </w:r>
-      <w:r>
-        <w:rPr>
-          <w:rFonts w:ascii="Times New Roman" w:hAnsi="Times New Roman"/>
-          <w:i/>
-          <w:iCs/>
-          <w:sz w:val="22"/>
-        </w:rPr>
-        <w:t>(</w:t>
-      </w:r>
-      <w:r>
-        <w:rPr>
-          <w:rFonts w:ascii="Times New Roman" w:hAnsi="Times New Roman"/>
-          <w:b/>
-          <w:bCs/>
-          <w:i/>
-          <w:iCs/>
-          <w:sz w:val="22"/>
-        </w:rPr>
-        <w:t>BIBM</w:t>
-      </w:r>
-      <w:r>
-        <w:rPr>
-          <w:rFonts w:ascii="Times New Roman" w:hAnsi="Times New Roman"/>
-          <w:i/>
-          <w:iCs/>
-          <w:sz w:val="22"/>
-        </w:rPr>
-        <w:t>)</w:t>
-      </w:r>
-      <w:r>
-        <w:rPr>
-          <w:rFonts w:ascii="Times New Roman" w:hAnsi="Times New Roman"/>
-          <w:b/>
-          <w:sz w:val="22"/>
-        </w:rPr>
-        <w:t xml:space="preserve">, </w:t>
-      </w:r>
-      <w:r>
-        <w:rPr>
-          <w:rFonts w:ascii="Times New Roman" w:hAnsi="Times New Roman"/>
-          <w:sz w:val="22"/>
-        </w:rPr>
-        <w:t>201</w:t>
-      </w:r>
-      <w:r>
-        <w:rPr>
-          <w:rFonts w:ascii="Times New Roman" w:hAnsi="Times New Roman"/>
-          <w:sz w:val="22"/>
-        </w:rPr>
-        <w:t>9</w:t>
-      </w:r>
-      <w:r>
-        <w:rPr>
-          <w:rFonts w:ascii="Times New Roman" w:hAnsi="Times New Roman"/>
-          <w:sz w:val="22"/>
-        </w:rPr>
-        <w:t>.</w:t>
-      </w:r>
-      <w:r>
-        <w:rPr>
-          <w:rFonts w:ascii="Times New Roman" w:hAnsi="Times New Roman"/>
-          <w:sz w:val="22"/>
-        </w:rPr>
-        <w:t xml:space="preserve"> [</w:t>
+        <w:t>[</w:t>
       </w:r>
       <w:hyperlink r:id="rId10" w:history="1">
         <w:r>
@@ -2212,6 +2176,7 @@
       </w:hyperlink>
       <w:r>
         <w:rPr>
+          <w:rStyle w:val="a4"/>
           <w:rFonts w:ascii="Times New Roman" w:hAnsi="Times New Roman"/>
           <w:sz w:val="22"/>
         </w:rPr>
@@ -2227,22 +2192,215 @@
         <w:snapToGrid w:val="0"/>
         <w:rPr>
           <w:rFonts w:ascii="Times New Roman" w:hAnsi="Times New Roman"/>
-          <w:b/>
-          <w:sz w:val="22"/>
-          <w:u w:val="single"/>
-        </w:rPr>
-      </w:pPr>
-      <w:r>
-        <w:rPr>
-          <w:rFonts w:ascii="Times New Roman" w:hAnsi="Times New Roman"/>
-          <w:sz w:val="22"/>
-        </w:rPr>
-        <w:t>[2]</w:t>
-      </w:r>
-      <w:r>
-        <w:rPr>
-          <w:rFonts w:ascii="Times New Roman" w:hAnsi="Times New Roman"/>
-          <w:b/>
+          <w:sz w:val="22"/>
+        </w:rPr>
+      </w:pPr>
+      <w:r>
+        <w:rPr>
+          <w:rFonts w:ascii="Times New Roman" w:hAnsi="Times New Roman" w:hint="eastAsia"/>
+          <w:sz w:val="22"/>
+        </w:rPr>
+        <w:t>[</w:t>
+      </w:r>
+      <w:r>
+        <w:rPr>
+          <w:rFonts w:ascii="Times New Roman" w:hAnsi="Times New Roman"/>
+          <w:sz w:val="22"/>
+        </w:rPr>
+        <w:t>3</w:t>
+      </w:r>
+      <w:r>
+        <w:rPr>
+          <w:rFonts w:ascii="Times New Roman" w:hAnsi="Times New Roman"/>
+          <w:sz w:val="22"/>
+        </w:rPr>
+        <w:t xml:space="preserve">] </w:t>
+      </w:r>
+      <w:proofErr w:type="spellStart"/>
+      <w:r>
+        <w:rPr>
+          <w:rFonts w:ascii="Times New Roman" w:hAnsi="Times New Roman"/>
+          <w:sz w:val="22"/>
+        </w:rPr>
+        <w:t>Daheng</w:t>
+      </w:r>
+      <w:proofErr w:type="spellEnd"/>
+      <w:r>
+        <w:rPr>
+          <w:rFonts w:ascii="Times New Roman" w:hAnsi="Times New Roman"/>
+          <w:sz w:val="22"/>
+        </w:rPr>
+        <w:t xml:space="preserve"> Wang, </w:t>
+      </w:r>
+      <w:r>
+        <w:rPr>
+          <w:rFonts w:ascii="Times New Roman" w:hAnsi="Times New Roman"/>
+          <w:b/>
+          <w:sz w:val="22"/>
+        </w:rPr>
+        <w:t>Zhihan Zhang</w:t>
+      </w:r>
+      <w:r>
+        <w:rPr>
+          <w:rFonts w:ascii="Times New Roman" w:hAnsi="Times New Roman"/>
+          <w:sz w:val="22"/>
+        </w:rPr>
+        <w:t xml:space="preserve">, </w:t>
+      </w:r>
+      <w:proofErr w:type="spellStart"/>
+      <w:r>
+        <w:rPr>
+          <w:rFonts w:ascii="Times New Roman" w:hAnsi="Times New Roman"/>
+          <w:sz w:val="22"/>
+        </w:rPr>
+        <w:t>Yihong</w:t>
+      </w:r>
+      <w:proofErr w:type="spellEnd"/>
+      <w:r>
+        <w:rPr>
+          <w:rFonts w:ascii="Times New Roman" w:hAnsi="Times New Roman"/>
+          <w:sz w:val="22"/>
+        </w:rPr>
+        <w:t xml:space="preserve"> Ma, Tong Zhao, </w:t>
+      </w:r>
+      <w:proofErr w:type="spellStart"/>
+      <w:r>
+        <w:rPr>
+          <w:rFonts w:ascii="Times New Roman" w:hAnsi="Times New Roman"/>
+          <w:sz w:val="22"/>
+        </w:rPr>
+        <w:t>Tianwen</w:t>
+      </w:r>
+      <w:proofErr w:type="spellEnd"/>
+      <w:r>
+        <w:rPr>
+          <w:rFonts w:ascii="Times New Roman" w:hAnsi="Times New Roman"/>
+          <w:sz w:val="22"/>
+        </w:rPr>
+        <w:t xml:space="preserve"> Jiang, Nitesh Chawla and Meng Jiang</w:t>
+      </w:r>
+      <w:r>
+        <w:rPr>
+          <w:rFonts w:ascii="Times New Roman" w:hAnsi="Times New Roman"/>
+          <w:sz w:val="22"/>
+        </w:rPr>
+        <w:t xml:space="preserve">. </w:t>
+      </w:r>
+      <w:r>
+        <w:rPr>
+          <w:rFonts w:ascii="Times New Roman" w:hAnsi="Times New Roman"/>
+          <w:sz w:val="22"/>
+        </w:rPr>
+        <w:t>Learning Attribute-Structure Co-Evolutions in Dynamic Graphs</w:t>
+      </w:r>
+      <w:r>
+        <w:rPr>
+          <w:rFonts w:ascii="Times New Roman" w:hAnsi="Times New Roman"/>
+          <w:sz w:val="22"/>
+        </w:rPr>
+        <w:t xml:space="preserve">. In </w:t>
+      </w:r>
+      <w:r>
+        <w:rPr>
+          <w:rFonts w:ascii="Times New Roman" w:hAnsi="Times New Roman"/>
+          <w:i/>
+          <w:sz w:val="22"/>
+        </w:rPr>
+        <w:t>KDD Workshop on Deep Learning on Graphs: Methods and Applications (</w:t>
+      </w:r>
+      <w:r>
+        <w:rPr>
+          <w:rFonts w:ascii="Times New Roman" w:hAnsi="Times New Roman"/>
+          <w:b/>
+          <w:i/>
+          <w:sz w:val="22"/>
+        </w:rPr>
+        <w:t>KDD-DLG</w:t>
+      </w:r>
+      <w:r>
+        <w:rPr>
+          <w:rFonts w:ascii="Times New Roman" w:hAnsi="Times New Roman"/>
+          <w:i/>
+          <w:sz w:val="22"/>
+        </w:rPr>
+        <w:t>)</w:t>
+      </w:r>
+      <w:r>
+        <w:rPr>
+          <w:rFonts w:ascii="Times New Roman" w:hAnsi="Times New Roman"/>
+          <w:sz w:val="22"/>
+        </w:rPr>
+        <w:t>, 2020.</w:t>
+      </w:r>
+    </w:p>
+    <w:p>
+      <w:pPr>
+        <w:tabs>
+          <w:tab w:val="right" w:pos="10490"/>
+        </w:tabs>
+        <w:adjustRightInd w:val="0"/>
+        <w:snapToGrid w:val="0"/>
+        <w:rPr>
+          <w:rFonts w:ascii="Times New Roman" w:hAnsi="Times New Roman"/>
+          <w:sz w:val="22"/>
+        </w:rPr>
+      </w:pPr>
+      <w:r>
+        <w:rPr>
+          <w:rFonts w:ascii="Times New Roman" w:hAnsi="Times New Roman"/>
+          <w:sz w:val="22"/>
+        </w:rPr>
+        <w:t>[</w:t>
+      </w:r>
+      <w:r>
+        <w:rPr>
+          <w:rFonts w:ascii="Times New Roman" w:hAnsi="Times New Roman"/>
+          <w:sz w:val="22"/>
+        </w:rPr>
+        <w:t>2</w:t>
+      </w:r>
+      <w:r>
+        <w:rPr>
+          <w:rFonts w:ascii="Times New Roman" w:hAnsi="Times New Roman"/>
+          <w:sz w:val="22"/>
+        </w:rPr>
+        <w:t xml:space="preserve">] </w:t>
+      </w:r>
+      <w:proofErr w:type="spellStart"/>
+      <w:r>
+        <w:rPr>
+          <w:rFonts w:ascii="Times New Roman" w:hAnsi="Times New Roman"/>
+          <w:sz w:val="22"/>
+        </w:rPr>
+        <w:t>Tianwen</w:t>
+      </w:r>
+      <w:proofErr w:type="spellEnd"/>
+      <w:r>
+        <w:rPr>
+          <w:rFonts w:ascii="Times New Roman" w:hAnsi="Times New Roman"/>
+          <w:sz w:val="22"/>
+        </w:rPr>
+        <w:t xml:space="preserve"> Jiang*, </w:t>
+      </w:r>
+      <w:r>
+        <w:rPr>
+          <w:rFonts w:ascii="Times New Roman" w:hAnsi="Times New Roman"/>
+          <w:b/>
+          <w:sz w:val="22"/>
+        </w:rPr>
+        <w:t>Zhihan Zhang</w:t>
+      </w:r>
+      <w:r>
+        <w:rPr>
+          <w:rFonts w:ascii="Times New Roman" w:hAnsi="Times New Roman"/>
+          <w:sz w:val="22"/>
+        </w:rPr>
+        <w:t>*, Tong Zhao, Bing Qin, Ting Liu, Nitesh Chawla and Meng Jiang. CTGA: Graph-based Biomedical Literature Search.</w:t>
+      </w:r>
+      <w:r>
+        <w:rPr>
+          <w:rFonts w:ascii="Times New Roman" w:hAnsi="Times New Roman"/>
+          <w:i/>
           <w:sz w:val="22"/>
         </w:rPr>
         <w:t xml:space="preserve"> </w:t>
@@ -2250,102 +2408,83 @@
       <w:r>
         <w:rPr>
           <w:rFonts w:ascii="Times New Roman" w:hAnsi="Times New Roman"/>
-          <w:b/>
-          <w:sz w:val="22"/>
-        </w:rPr>
-        <w:t>Zhihan Zhang</w:t>
-      </w:r>
-      <w:r>
-        <w:rPr>
-          <w:rFonts w:ascii="Times New Roman" w:hAnsi="Times New Roman"/>
+          <w:sz w:val="22"/>
+        </w:rPr>
+        <w:t>In </w:t>
+      </w:r>
+      <w:r>
+        <w:rPr>
+          <w:rFonts w:ascii="Times New Roman" w:hAnsi="Times New Roman"/>
+          <w:i/>
+          <w:iCs/>
+          <w:sz w:val="22"/>
+        </w:rPr>
+        <w:t>IEEE International Conference on Bioinformatics and Biomedicine</w:t>
+      </w:r>
+      <w:r>
+        <w:rPr>
+          <w:rFonts w:ascii="Times New Roman" w:hAnsi="Times New Roman"/>
+          <w:b/>
+          <w:i/>
+          <w:iCs/>
+          <w:sz w:val="22"/>
+        </w:rPr>
+        <w:t xml:space="preserve"> </w:t>
+      </w:r>
+      <w:r>
+        <w:rPr>
+          <w:rFonts w:ascii="Times New Roman" w:hAnsi="Times New Roman"/>
+          <w:i/>
+          <w:iCs/>
+          <w:sz w:val="22"/>
+        </w:rPr>
+        <w:t>(</w:t>
+      </w:r>
+      <w:r>
+        <w:rPr>
+          <w:rFonts w:ascii="Times New Roman" w:hAnsi="Times New Roman"/>
+          <w:b/>
+          <w:bCs/>
+          <w:i/>
+          <w:iCs/>
+          <w:sz w:val="22"/>
+        </w:rPr>
+        <w:t>BIBM</w:t>
+      </w:r>
+      <w:r>
+        <w:rPr>
+          <w:rFonts w:ascii="Times New Roman" w:hAnsi="Times New Roman"/>
+          <w:i/>
+          <w:iCs/>
+          <w:sz w:val="22"/>
+        </w:rPr>
+        <w:t>)</w:t>
+      </w:r>
+      <w:r>
+        <w:rPr>
+          <w:rFonts w:ascii="Times New Roman" w:hAnsi="Times New Roman"/>
+          <w:b/>
           <w:sz w:val="22"/>
         </w:rPr>
         <w:t xml:space="preserve">, </w:t>
       </w:r>
-      <w:proofErr w:type="spellStart"/>
-      <w:r>
-        <w:rPr>
-          <w:rFonts w:ascii="Times New Roman" w:hAnsi="Times New Roman"/>
-          <w:sz w:val="22"/>
-        </w:rPr>
-        <w:t>Zhiyi</w:t>
-      </w:r>
-      <w:proofErr w:type="spellEnd"/>
-      <w:r>
-        <w:rPr>
-          <w:rFonts w:ascii="Times New Roman" w:hAnsi="Times New Roman"/>
-          <w:sz w:val="22"/>
-        </w:rPr>
-        <w:t xml:space="preserve"> Yin, </w:t>
-      </w:r>
-      <w:proofErr w:type="spellStart"/>
-      <w:r>
-        <w:rPr>
-          <w:rFonts w:ascii="Times New Roman" w:hAnsi="Times New Roman"/>
-          <w:sz w:val="22"/>
-        </w:rPr>
-        <w:t>Shuhuai</w:t>
-      </w:r>
-      <w:proofErr w:type="spellEnd"/>
-      <w:r>
-        <w:rPr>
-          <w:rFonts w:ascii="Times New Roman" w:hAnsi="Times New Roman"/>
-          <w:sz w:val="22"/>
-        </w:rPr>
-        <w:t xml:space="preserve"> Ren, </w:t>
-      </w:r>
-      <w:proofErr w:type="spellStart"/>
-      <w:r>
-        <w:rPr>
-          <w:rFonts w:ascii="Times New Roman" w:hAnsi="Times New Roman"/>
-          <w:sz w:val="22"/>
-        </w:rPr>
-        <w:t>Xinhang</w:t>
-      </w:r>
-      <w:proofErr w:type="spellEnd"/>
-      <w:r>
-        <w:rPr>
-          <w:rFonts w:ascii="Times New Roman" w:hAnsi="Times New Roman"/>
-          <w:sz w:val="22"/>
-        </w:rPr>
-        <w:t xml:space="preserve"> Li and </w:t>
-      </w:r>
-      <w:proofErr w:type="spellStart"/>
-      <w:r>
-        <w:rPr>
-          <w:rFonts w:ascii="Times New Roman" w:hAnsi="Times New Roman"/>
-          <w:sz w:val="22"/>
-        </w:rPr>
-        <w:t>Shicheng</w:t>
-      </w:r>
-      <w:proofErr w:type="spellEnd"/>
-      <w:r>
-        <w:rPr>
-          <w:rFonts w:ascii="Times New Roman" w:hAnsi="Times New Roman"/>
-          <w:sz w:val="22"/>
-        </w:rPr>
-        <w:t xml:space="preserve"> Li. DCA: Diversified Co-Attention </w:t>
-      </w:r>
-      <w:bookmarkStart w:id="7" w:name="_Hlk25177259"/>
-      <w:r>
-        <w:rPr>
-          <w:rFonts w:ascii="Times New Roman" w:hAnsi="Times New Roman" w:hint="eastAsia"/>
-          <w:sz w:val="22"/>
-        </w:rPr>
-        <w:t>t</w:t>
-      </w:r>
-      <w:r>
-        <w:rPr>
-          <w:rFonts w:ascii="Times New Roman" w:hAnsi="Times New Roman"/>
-          <w:sz w:val="22"/>
-        </w:rPr>
-        <w:t>owards Informative Live Video Commenting</w:t>
-      </w:r>
-      <w:bookmarkEnd w:id="7"/>
-      <w:r>
-        <w:rPr>
-          <w:rFonts w:ascii="Times New Roman" w:hAnsi="Times New Roman"/>
-          <w:i/>
+      <w:r>
+        <w:rPr>
+          <w:rFonts w:ascii="Times New Roman" w:hAnsi="Times New Roman"/>
+          <w:sz w:val="22"/>
+        </w:rPr>
+        <w:t>201</w:t>
+      </w:r>
+      <w:r>
+        <w:rPr>
+          <w:rFonts w:ascii="Times New Roman" w:hAnsi="Times New Roman"/>
+          <w:sz w:val="22"/>
+        </w:rPr>
+        <w:t>9</w:t>
+      </w:r>
+      <w:r>
+        <w:rPr>
+          <w:rFonts w:ascii="Times New Roman" w:hAnsi="Times New Roman"/>
           <w:sz w:val="22"/>
         </w:rPr>
         <w:t>.</w:t>
@@ -2355,53 +2494,7 @@
           <w:rFonts w:ascii="Times New Roman" w:hAnsi="Times New Roman"/>
           <w:sz w:val="22"/>
         </w:rPr>
-        <w:t xml:space="preserve"> </w:t>
-      </w:r>
-      <w:r>
-        <w:rPr>
-          <w:rFonts w:ascii="Times New Roman" w:hAnsi="Times New Roman"/>
-          <w:sz w:val="22"/>
-        </w:rPr>
-        <w:t xml:space="preserve">In </w:t>
-      </w:r>
-      <w:proofErr w:type="spellStart"/>
-      <w:r>
-        <w:rPr>
-          <w:rFonts w:ascii="Times New Roman" w:hAnsi="Times New Roman"/>
-          <w:i/>
-          <w:sz w:val="22"/>
-        </w:rPr>
-        <w:t>Arxiv</w:t>
-      </w:r>
-      <w:proofErr w:type="spellEnd"/>
-      <w:r>
-        <w:rPr>
-          <w:rFonts w:ascii="Times New Roman" w:hAnsi="Times New Roman"/>
-          <w:i/>
-          <w:sz w:val="22"/>
-        </w:rPr>
-        <w:t xml:space="preserve"> preprint arXiv:1911.02739</w:t>
-      </w:r>
-      <w:r>
-        <w:rPr>
-          <w:rFonts w:ascii="Times New Roman" w:hAnsi="Times New Roman"/>
-          <w:sz w:val="22"/>
-        </w:rPr>
-        <w:t>.</w:t>
-      </w:r>
-      <w:r>
-        <w:rPr>
-          <w:rFonts w:ascii="Times New Roman" w:hAnsi="Times New Roman"/>
-          <w:sz w:val="22"/>
-        </w:rPr>
-        <w:t xml:space="preserve"> </w:t>
-      </w:r>
-      <w:r>
-        <w:rPr>
-          <w:rFonts w:ascii="Times New Roman" w:hAnsi="Times New Roman"/>
-          <w:sz w:val="22"/>
-        </w:rPr>
-        <w:t>[</w:t>
+        <w:t xml:space="preserve"> [</w:t>
       </w:r>
       <w:hyperlink r:id="rId11" w:history="1">
         <w:r>
@@ -2415,7 +2508,6 @@
       </w:hyperlink>
       <w:r>
         <w:rPr>
-          <w:rStyle w:val="a4"/>
           <w:rFonts w:ascii="Times New Roman" w:hAnsi="Times New Roman"/>
           <w:sz w:val="22"/>
         </w:rPr>
@@ -2525,7 +2617,7 @@
         </w:rPr>
         <w:t xml:space="preserve"> Huang and Xu Sun. Cross-Modal Commentator:</w:t>
       </w:r>
-      <w:bookmarkStart w:id="8" w:name="_Hlk25177309"/>
+      <w:bookmarkStart w:id="7" w:name="_Hlk25177309"/>
       <w:r>
         <w:rPr>
           <w:rFonts w:ascii="Times New Roman" w:hAnsi="Times New Roman"/>
@@ -2533,7 +2625,7 @@
         </w:rPr>
         <w:t xml:space="preserve"> Automatic Machine Commenting Based on Cross-Modal Information</w:t>
       </w:r>
-      <w:bookmarkEnd w:id="8"/>
+      <w:bookmarkEnd w:id="7"/>
       <w:r>
         <w:rPr>
           <w:rFonts w:ascii="Times New Roman" w:hAnsi="Times New Roman"/>
@@ -2674,6 +2766,21 @@
     </w:p>
     <w:p>
       <w:pPr>
+        <w:tabs>
+          <w:tab w:val="right" w:pos="10490"/>
+        </w:tabs>
+        <w:adjustRightInd w:val="0"/>
+        <w:snapToGrid w:val="0"/>
+        <w:rPr>
+          <w:rFonts w:ascii="Times New Roman" w:hAnsi="Times New Roman" w:hint="eastAsia"/>
+          <w:sz w:val="22"/>
+        </w:rPr>
+      </w:pPr>
+      <w:bookmarkStart w:id="8" w:name="_GoBack"/>
+      <w:bookmarkEnd w:id="8"/>
+    </w:p>
+    <w:p>
+      <w:pPr>
         <w:pStyle w:val="af0"/>
         <w:adjustRightInd w:val="0"/>
         <w:snapToGrid w:val="0"/>
@@ -2693,6 +2800,7 @@
           <w:szCs w:val="20"/>
           <w:u w:val="single"/>
         </w:rPr>
+        <w:lastRenderedPageBreak/>
         <w:t xml:space="preserve">HONORS AND </w:t>
       </w:r>
       <w:r>
@@ -2801,7 +2909,6 @@
           <w:sz w:val="22"/>
           <w:szCs w:val="20"/>
         </w:rPr>
-        <w:lastRenderedPageBreak/>
         <w:t xml:space="preserve">  </w:t>
       </w:r>
       <w:r>
@@ -3754,7 +3861,7 @@
         <v:path o:extrusionok="f" gradientshapeok="t" o:connecttype="rect"/>
         <o:lock v:ext="edit" aspectratio="t"/>
       </v:shapetype>
-      <v:shape id="_x0000_i1027" type="#_x0000_t75" style="width:12pt;height:12pt" o:bullet="t">
+      <v:shape id="_x0000_i1031" type="#_x0000_t75" style="width:12pt;height:12pt" o:bullet="t">
         <v:imagedata r:id="rId1" o:title="mso9987"/>
       </v:shape>
     </w:pict>
@@ -7660,7 +7767,7 @@
 </file>
 
 <file path=customXml/itemProps1.xml><?xml version="1.0" encoding="utf-8"?>
-<ds:datastoreItem xmlns:ds="http://schemas.openxmlformats.org/officeDocument/2006/customXml" ds:itemID="{10F3B403-3693-4E1B-9D7A-533CA90E9483}">
+<ds:datastoreItem xmlns:ds="http://schemas.openxmlformats.org/officeDocument/2006/customXml" ds:itemID="{E7CCA691-2586-4A70-9E14-1A9B083B3D0E}">
   <ds:schemaRefs>
     <ds:schemaRef ds:uri="http://schemas.openxmlformats.org/officeDocument/2006/bibliography"/>
   </ds:schemaRefs>

</xml_diff>